<commit_message>
chore: regen CV PDF/DOCX avec lien GitHub
</commit_message>
<xml_diff>
--- a/public/cv-faycal-zouaoui.docx
+++ b/public/cv-faycal-zouaoui.docx
@@ -95,6 +95,18 @@
       </w:pPr>
       <w:r>
         <w:t xml:space="preserve">LinkedIn : https://www.linkedin.com/in/faycal-zouaoui-65b0a5201</w:t>
+      </w:r>
+    </w:p>
+    <w:p>
+      <w:pPr>
+        <w:pStyle w:val="Compact"/>
+        <w:numPr>
+          <w:ilvl w:val="0"/>
+          <w:numId w:val="1001"/>
+        </w:numPr>
+      </w:pPr>
+      <w:r>
+        <w:t xml:space="preserve">GitHub : https://github.com/zouaoui-faycal</w:t>
       </w:r>
     </w:p>
     <w:p>

</xml_diff>